<commit_message>
Requisitos ampliados con las restricciones del FollowUp 13-04
</commit_message>
<xml_diff>
--- a/reports/Group/02 - Requirements - Level B (Structured).docx
+++ b/reports/Group/02 - Requirements - Level B (Structured).docx
@@ -126,7 +126,13 @@
         <w:pStyle w:val="Requirement-HeaderS4"/>
       </w:pPr>
       <w:r>
-        <w:t xml:space="preserve">IR-B02. The manager profile must </w:t>
+        <w:t>IR-B02. T</w:t>
+      </w:r>
+      <w:r>
+        <w:t>h</w:t>
+      </w:r>
+      <w:r>
+        <w:t xml:space="preserve">e manager profile must </w:t>
       </w:r>
       <w:r>
         <w:t>include</w:t>
@@ -492,6 +498,9 @@
         <w:pStyle w:val="Requirement-HeaderS4"/>
       </w:pPr>
       <w:r>
+        <w:t xml:space="preserve"> </w:t>
+      </w:r>
+      <w:r>
         <w:t>IR-B10. The system must compute total components of a project.</w:t>
       </w:r>
     </w:p>
@@ -509,23 +518,18 @@
         <w:pStyle w:val="Requirement-HeaderS4"/>
       </w:pPr>
       <w:r>
-        <w:t>IR-B11. A manager manages zero or more projects and a project is managed by exactly one manager.</w:t>
-      </w:r>
-    </w:p>
-    <w:p>
-      <w:pPr>
-        <w:pStyle w:val="Ttulo2"/>
-      </w:pPr>
-      <w:r>
-        <w:t>Functional requirements</w:t>
-      </w:r>
-    </w:p>
-    <w:p>
-      <w:pPr>
-        <w:pStyle w:val="Requirement-HeaderS4"/>
-      </w:pPr>
-      <w:r>
-        <w:t>FR-B01. Any authenticated principal must be able to acquire role manager and update the corresponding manager profile.</w:t>
+        <w:t xml:space="preserve"> </w:t>
+      </w:r>
+      <w:r>
+        <w:t xml:space="preserve">IR-B11. A manager manages zero or more </w:t>
+      </w:r>
+      <w:proofErr w:type="gramStart"/>
+      <w:r>
+        <w:t>projects</w:t>
+      </w:r>
+      <w:proofErr w:type="gramEnd"/>
+      <w:r>
+        <w:t xml:space="preserve"> and a project is managed by exactly one manager.</w:t>
       </w:r>
     </w:p>
     <w:p>
@@ -541,6 +545,68 @@
       <w:pPr>
         <w:pStyle w:val="Requirement-HeaderS4"/>
       </w:pPr>
+      <w:r>
+        <w:t xml:space="preserve"> IR-B12. </w:t>
+      </w:r>
+      <w:r>
+        <w:t xml:space="preserve">The system must support a new realm of type Squad: </w:t>
+      </w:r>
+      <w:proofErr w:type="spellStart"/>
+      <w:r>
+        <w:rPr>
+          <w:b/>
+          <w:bCs/>
+        </w:rPr>
+        <w:t>ProjectMember</w:t>
+      </w:r>
+      <w:proofErr w:type="spellEnd"/>
+      <w:r>
+        <w:t xml:space="preserve">. This realm is automatically acquired by any principal added to a project as manager, spokesperson, fundraiser, or inventor. Any principal holding this realm for a given project may access </w:t>
+      </w:r>
+      <w:proofErr w:type="gramStart"/>
+      <w:r>
+        <w:t>all of</w:t>
+      </w:r>
+      <w:proofErr w:type="gramEnd"/>
+      <w:r>
+        <w:t xml:space="preserve"> its data and components regardless of their publication state.</w:t>
+      </w:r>
+    </w:p>
+    <w:p>
+      <w:pPr>
+        <w:pStyle w:val="Ttulo2"/>
+      </w:pPr>
+      <w:r>
+        <w:t>Functional requirements</w:t>
+      </w:r>
+    </w:p>
+    <w:p>
+      <w:pPr>
+        <w:pStyle w:val="Requirement-HeaderS4"/>
+      </w:pPr>
+      <w:r>
+        <w:t xml:space="preserve"> </w:t>
+      </w:r>
+      <w:r>
+        <w:t>FR-B01. Any authenticated principal must be able to acquire role manager and update the corresponding manager profile.</w:t>
+      </w:r>
+    </w:p>
+    <w:p>
+      <w:pPr>
+        <w:pStyle w:val="Requirement-HeaderS4"/>
+        <w:numPr>
+          <w:ilvl w:val="0"/>
+          <w:numId w:val="0"/>
+        </w:numPr>
+      </w:pPr>
+    </w:p>
+    <w:p>
+      <w:pPr>
+        <w:pStyle w:val="Requirement-HeaderS4"/>
+      </w:pPr>
+      <w:r>
+        <w:t xml:space="preserve"> </w:t>
+      </w:r>
       <w:r>
         <w:t xml:space="preserve">FR-B02. A manager must be able to </w:t>
       </w:r>
@@ -599,6 +665,9 @@
         <w:pStyle w:val="Requirement-HeaderS4"/>
       </w:pPr>
       <w:r>
+        <w:t xml:space="preserve"> </w:t>
+      </w:r>
+      <w:r>
         <w:t>FR-B03. A manager must be able to select and manage project members (inventors, spokespeople, and fundraisers).</w:t>
       </w:r>
     </w:p>
@@ -616,7 +685,26 @@
         <w:pStyle w:val="Requirement-HeaderS4"/>
       </w:pPr>
       <w:r>
-        <w:t xml:space="preserve">FR-B04. Project members must be able to add their </w:t>
+        <w:lastRenderedPageBreak/>
+        <w:t xml:space="preserve"> </w:t>
+      </w:r>
+      <w:r>
+        <w:t xml:space="preserve">FR-B04. </w:t>
+      </w:r>
+      <w:r>
+        <w:t xml:space="preserve">Any principal holding the </w:t>
+      </w:r>
+      <w:proofErr w:type="spellStart"/>
+      <w:r>
+        <w:rPr>
+          <w:b/>
+          <w:bCs/>
+        </w:rPr>
+        <w:t>ProjectMember</w:t>
+      </w:r>
+      <w:proofErr w:type="spellEnd"/>
+      <w:r>
+        <w:t xml:space="preserve"> realm for a given project must be able to add their </w:t>
       </w:r>
       <w:r>
         <w:rPr>
@@ -646,7 +734,7 @@
         <w:t>strategies</w:t>
       </w:r>
       <w:r>
-        <w:t xml:space="preserve"> to projects in which they are involved, even when these components are unpublished.</w:t>
+        <w:t xml:space="preserve"> to that project, even when those components are unpublished.</w:t>
       </w:r>
     </w:p>
     <w:p>
@@ -663,8 +751,28 @@
         <w:pStyle w:val="Requirement-HeaderS4"/>
       </w:pPr>
       <w:r>
-        <w:lastRenderedPageBreak/>
-        <w:t>FR-B05. Any project member must be able to display project data, including unpublished project data.</w:t>
+        <w:t xml:space="preserve"> </w:t>
+      </w:r>
+      <w:r>
+        <w:t xml:space="preserve">FR-B05. </w:t>
+      </w:r>
+      <w:r>
+        <w:t xml:space="preserve">Any principal holding the </w:t>
+      </w:r>
+      <w:proofErr w:type="spellStart"/>
+      <w:r>
+        <w:rPr>
+          <w:b/>
+          <w:bCs/>
+        </w:rPr>
+        <w:t>ProjectMember</w:t>
+      </w:r>
+      <w:proofErr w:type="spellEnd"/>
+      <w:r>
+        <w:t xml:space="preserve"> realm for a given project </w:t>
+      </w:r>
+      <w:r>
+        <w:t>must be able to display project data, including unpublished project data.</w:t>
       </w:r>
     </w:p>
     <w:p>
@@ -681,7 +789,49 @@
         <w:pStyle w:val="Requirement-HeaderS4"/>
       </w:pPr>
       <w:r>
-        <w:t>FR-B06. A manager must be able to publish his or her projects only when they include at least one invention.</w:t>
+        <w:t xml:space="preserve"> </w:t>
+      </w:r>
+      <w:r>
+        <w:t>FR-B06. A manager must be able to publish his or her own projects, subject to all the following publication constraints</w:t>
+      </w:r>
+      <w:r>
+        <w:t>:</w:t>
+      </w:r>
+    </w:p>
+    <w:p>
+      <w:pPr>
+        <w:pStyle w:val="Requirement-HeaderS4"/>
+        <w:numPr>
+          <w:ilvl w:val="0"/>
+          <w:numId w:val="19"/>
+        </w:numPr>
+      </w:pPr>
+      <w:r>
+        <w:t>A manager may only publish projects that he or she manages; no other principal may trigger publication.</w:t>
+      </w:r>
+    </w:p>
+    <w:p>
+      <w:pPr>
+        <w:pStyle w:val="Requirement-HeaderS4"/>
+        <w:numPr>
+          <w:ilvl w:val="0"/>
+          <w:numId w:val="19"/>
+        </w:numPr>
+      </w:pPr>
+      <w:r>
+        <w:t>The kick-off moment must be strictly before the close-out moment; both moments must lie in the future at the time of publication. The time interval of every component must be contained within the project’s [kick-off, close-out] interval.</w:t>
+      </w:r>
+    </w:p>
+    <w:p>
+      <w:pPr>
+        <w:pStyle w:val="Requirement-HeaderS4"/>
+        <w:numPr>
+          <w:ilvl w:val="0"/>
+          <w:numId w:val="19"/>
+        </w:numPr>
+      </w:pPr>
+      <w:r>
+        <w:t>The project must contain at least one invention. Every component must individually satisfy its own publication constraints before the project can be published.</w:t>
       </w:r>
     </w:p>
     <w:p>
@@ -698,6 +848,9 @@
         <w:pStyle w:val="Requirement-HeaderS4"/>
       </w:pPr>
       <w:r>
+        <w:t xml:space="preserve"> </w:t>
+      </w:r>
+      <w:r>
         <w:t>FR-B07. Publishing a project must automatically publish all its components.</w:t>
       </w:r>
     </w:p>
@@ -714,6 +867,9 @@
       <w:pPr>
         <w:pStyle w:val="Requirement-HeaderS4"/>
       </w:pPr>
+      <w:r>
+        <w:t xml:space="preserve"> </w:t>
+      </w:r>
       <w:r>
         <w:t xml:space="preserve">FR-B08. Managers must have </w:t>
       </w:r>
@@ -742,7 +898,13 @@
         <w:pStyle w:val="Requirement-HeaderS4"/>
       </w:pPr>
       <w:r>
-        <w:t xml:space="preserve">FR-B09. Any </w:t>
+        <w:t xml:space="preserve"> </w:t>
+      </w:r>
+      <w:r>
+        <w:t xml:space="preserve">FR-B09. </w:t>
+      </w:r>
+      <w:r>
+        <w:t xml:space="preserve">Any </w:t>
       </w:r>
       <w:r>
         <w:rPr>
@@ -752,7 +914,7 @@
         <w:t>sponsor</w:t>
       </w:r>
       <w:r>
-        <w:t xml:space="preserve"> may sponsor any published project by attaching any of his or her published sponsorships.</w:t>
+        <w:t xml:space="preserve"> may sponsor any published project by attaching any of his or her published sponsorships, provided that the sponsorship date is strictly after the project’s close-out moment.</w:t>
       </w:r>
     </w:p>
     <w:p>
@@ -769,7 +931,13 @@
         <w:pStyle w:val="Requirement-HeaderS4"/>
       </w:pPr>
       <w:r>
-        <w:t xml:space="preserve">FR-B10. Any </w:t>
+        <w:t xml:space="preserve"> </w:t>
+      </w:r>
+      <w:r>
+        <w:t xml:space="preserve">FR-B10. </w:t>
+      </w:r>
+      <w:r>
+        <w:t xml:space="preserve">Any </w:t>
       </w:r>
       <w:r>
         <w:rPr>
@@ -779,7 +947,7 @@
         <w:t>auditor</w:t>
       </w:r>
       <w:r>
-        <w:t xml:space="preserve"> may audit any published project by attaching any of his or her published audit reports.</w:t>
+        <w:t xml:space="preserve"> may audit any published project by attaching any of his or her published audit reports, provided that the start date of the audit report is strictly after the project’s close-out moment.</w:t>
       </w:r>
     </w:p>
     <w:p>
@@ -795,6 +963,9 @@
       <w:pPr>
         <w:pStyle w:val="Requirement-HeaderS4"/>
       </w:pPr>
+      <w:r>
+        <w:t xml:space="preserve"> </w:t>
+      </w:r>
       <w:r>
         <w:t xml:space="preserve">FR-B11. The </w:t>
       </w:r>
@@ -822,6 +993,9 @@
         <w:pStyle w:val="Requirement-HeaderS4"/>
       </w:pPr>
       <w:r>
+        <w:t xml:space="preserve"> </w:t>
+      </w:r>
+      <w:r>
         <w:t>NFR-B01. Ad banners must be shown as little intrusively as possible.</w:t>
       </w:r>
     </w:p>
@@ -839,7 +1013,28 @@
         <w:pStyle w:val="Requirement-HeaderS4"/>
       </w:pPr>
       <w:r>
-        <w:t>NFR-B02. Access control must prevent unauthorised access to unpublished project information by non-members.</w:t>
+        <w:t xml:space="preserve"> </w:t>
+      </w:r>
+      <w:r>
+        <w:t xml:space="preserve">NFR-B02. </w:t>
+      </w:r>
+      <w:r>
+        <w:t xml:space="preserve">Access control must prevent any principal who does not hold the </w:t>
+      </w:r>
+      <w:proofErr w:type="spellStart"/>
+      <w:r>
+        <w:rPr>
+          <w:b/>
+          <w:bCs/>
+        </w:rPr>
+        <w:t>ProjectMember</w:t>
+      </w:r>
+      <w:proofErr w:type="spellEnd"/>
+      <w:r>
+        <w:t xml:space="preserve"> realm for a given project from accessing its unpublished data or components</w:t>
+      </w:r>
+      <w:r>
+        <w:t>.</w:t>
       </w:r>
     </w:p>
     <w:p>
@@ -856,6 +1051,9 @@
         <w:pStyle w:val="Requirement-HeaderS4"/>
       </w:pPr>
       <w:r>
+        <w:t xml:space="preserve"> </w:t>
+      </w:r>
+      <w:r>
         <w:t>NFR-B03. Effort computation and dashboard indicators must be numerically consistent and reproducible.</w:t>
       </w:r>
     </w:p>
@@ -873,6 +1071,9 @@
         <w:pStyle w:val="Requirement-HeaderS4"/>
       </w:pPr>
       <w:r>
+        <w:t xml:space="preserve"> </w:t>
+      </w:r>
+      <w:r>
         <w:t>NFR-B04. Project publication and component publication must remain transactionally consistent.</w:t>
       </w:r>
     </w:p>
@@ -881,6 +1082,7 @@
         <w:pStyle w:val="Ttulo2"/>
       </w:pPr>
       <w:r>
+        <w:lastRenderedPageBreak/>
         <w:t>Testing requirements</w:t>
       </w:r>
     </w:p>
@@ -888,6 +1090,9 @@
       <w:pPr>
         <w:pStyle w:val="Requirement-HeaderS4"/>
       </w:pPr>
+      <w:r>
+        <w:t xml:space="preserve"> </w:t>
+      </w:r>
       <w:r>
         <w:t>TR-B01. Produce sample data with at least three managers and heterogeneous project portfolios.</w:t>
       </w:r>
@@ -906,6 +1111,9 @@
         <w:pStyle w:val="Requirement-HeaderS4"/>
       </w:pPr>
       <w:r>
+        <w:t xml:space="preserve"> </w:t>
+      </w:r>
+      <w:r>
         <w:t>TR-B02. Include projects with mixed publication states and multiple members/components to validate visibility and publication rules.</w:t>
       </w:r>
     </w:p>
@@ -923,7 +1131,88 @@
         <w:pStyle w:val="Requirement-HeaderS4"/>
       </w:pPr>
       <w:r>
-        <w:t>TR-B03. Validate precondition: projects cannot be published unless they contain at least one invention.</w:t>
+        <w:t xml:space="preserve"> </w:t>
+      </w:r>
+      <w:r>
+        <w:t>TR-B03. Validate precondition</w:t>
+      </w:r>
+      <w:r>
+        <w:t xml:space="preserve"> in projects publication</w:t>
+      </w:r>
+      <w:r>
+        <w:t>:</w:t>
+      </w:r>
+    </w:p>
+    <w:p>
+      <w:pPr>
+        <w:pStyle w:val="Requirement-HeaderS4"/>
+        <w:numPr>
+          <w:ilvl w:val="0"/>
+          <w:numId w:val="19"/>
+        </w:numPr>
+      </w:pPr>
+      <w:r>
+        <w:t>Publication is rejected when the principal triggering the publication is not the manager of the project.</w:t>
+      </w:r>
+    </w:p>
+    <w:p>
+      <w:pPr>
+        <w:pStyle w:val="Requirement-HeaderS4"/>
+        <w:numPr>
+          <w:ilvl w:val="0"/>
+          <w:numId w:val="19"/>
+        </w:numPr>
+      </w:pPr>
+      <w:r>
+        <w:t>P</w:t>
+      </w:r>
+      <w:r>
+        <w:t>rojects cannot be published unless they contain at least one invention.</w:t>
+      </w:r>
+    </w:p>
+    <w:p>
+      <w:pPr>
+        <w:pStyle w:val="Requirement-HeaderS4"/>
+        <w:numPr>
+          <w:ilvl w:val="0"/>
+          <w:numId w:val="19"/>
+        </w:numPr>
+      </w:pPr>
+      <w:r>
+        <w:t>P</w:t>
+      </w:r>
+      <w:r>
+        <w:t>ublication is rejected when the kick-off moment is not strictly before the close-out moment, or when either moment does not lie in the future at the time of publication.</w:t>
+      </w:r>
+    </w:p>
+    <w:p>
+      <w:pPr>
+        <w:pStyle w:val="Requirement-HeaderS4"/>
+        <w:numPr>
+          <w:ilvl w:val="0"/>
+          <w:numId w:val="19"/>
+        </w:numPr>
+      </w:pPr>
+      <w:r>
+        <w:t>P</w:t>
+      </w:r>
+      <w:r>
+        <w:t>ublication is rejected when any component’s time interval is not fully contained within the project’s [kick-off, close-out] interval.</w:t>
+      </w:r>
+    </w:p>
+    <w:p>
+      <w:pPr>
+        <w:pStyle w:val="Requirement-HeaderS4"/>
+        <w:numPr>
+          <w:ilvl w:val="0"/>
+          <w:numId w:val="19"/>
+        </w:numPr>
+      </w:pPr>
+      <w:r>
+        <w:t>P</w:t>
+      </w:r>
+      <w:r>
+        <w:t>ublication is rejected when any component does not individually satisfy its own publication constraints.</w:t>
       </w:r>
     </w:p>
     <w:p>
@@ -940,6 +1229,9 @@
         <w:pStyle w:val="Requirement-HeaderS4"/>
       </w:pPr>
       <w:r>
+        <w:t xml:space="preserve"> </w:t>
+      </w:r>
+      <w:r>
         <w:t>TR-B04. Validate automatic publication cascade from projects to components.</w:t>
       </w:r>
     </w:p>
@@ -957,7 +1249,9 @@
         <w:pStyle w:val="Requirement-HeaderS4"/>
       </w:pPr>
       <w:r>
-        <w:lastRenderedPageBreak/>
+        <w:t xml:space="preserve"> </w:t>
+      </w:r>
+      <w:r>
         <w:t>TR-B05. Validate effort computation and dashboard statistics with deterministic datasets</w:t>
       </w:r>
       <w:r>
@@ -978,6 +1272,9 @@
         <w:pStyle w:val="Requirement-HeaderS4"/>
       </w:pPr>
       <w:r>
+        <w:t xml:space="preserve"> </w:t>
+      </w:r>
+      <w:r>
         <w:t>TR-B06. Validate that only published sponsorships/audit reports can be attached to published projects.</w:t>
       </w:r>
     </w:p>
@@ -995,6 +1292,9 @@
         <w:pStyle w:val="Requirement-HeaderS4"/>
       </w:pPr>
       <w:r>
+        <w:t xml:space="preserve"> </w:t>
+      </w:r>
+      <w:r>
         <w:t>TR-B07. Validate administrator operations and rendering behaviour for ad banners.</w:t>
       </w:r>
     </w:p>
@@ -1012,11 +1312,63 @@
         <w:pStyle w:val="Requirement-HeaderS4"/>
       </w:pPr>
       <w:r>
+        <w:t xml:space="preserve"> </w:t>
+      </w:r>
+      <w:r>
         <w:t>TR-B08. Validate that non-members cannot view or manage draft projects, and that no principal can edit, delete, or publish projects that are already published.</w:t>
       </w:r>
     </w:p>
     <w:p>
       <w:pPr>
+        <w:pStyle w:val="Requirement-HeaderS4"/>
+        <w:numPr>
+          <w:ilvl w:val="0"/>
+          <w:numId w:val="0"/>
+        </w:numPr>
+      </w:pPr>
+    </w:p>
+    <w:p>
+      <w:pPr>
+        <w:pStyle w:val="Requirement-HeaderS4"/>
+      </w:pPr>
+      <w:r>
+        <w:t xml:space="preserve"> </w:t>
+      </w:r>
+      <w:r>
+        <w:t xml:space="preserve">TR-B09. </w:t>
+      </w:r>
+      <w:r>
+        <w:t>Validate that a sponsorship cannot be attached to a published project when the sponsorship date is not strictly after the project’s close-out moment.</w:t>
+      </w:r>
+    </w:p>
+    <w:p>
+      <w:pPr>
+        <w:pStyle w:val="Requirement-HeaderS4"/>
+        <w:numPr>
+          <w:ilvl w:val="0"/>
+          <w:numId w:val="0"/>
+        </w:numPr>
+      </w:pPr>
+    </w:p>
+    <w:p>
+      <w:pPr>
+        <w:pStyle w:val="Requirement-HeaderS4"/>
+      </w:pPr>
+      <w:r>
+        <w:t xml:space="preserve"> </w:t>
+      </w:r>
+      <w:r>
+        <w:t>TR-B1</w:t>
+      </w:r>
+      <w:r>
+        <w:t>0</w:t>
+      </w:r>
+      <w:r>
+        <w:t>. Validate that an audit report cannot be attached to a published project when the audit start date is not strictly after the project’s close-out moment.</w:t>
+      </w:r>
+    </w:p>
+    <w:p>
+      <w:pPr>
         <w:pStyle w:val="Ttulo2"/>
       </w:pPr>
       <w:r>
@@ -1027,6 +1379,9 @@
       <w:pPr>
         <w:pStyle w:val="Requirement-HeaderS4"/>
       </w:pPr>
+      <w:r>
+        <w:t xml:space="preserve"> </w:t>
+      </w:r>
       <w:r>
         <w:t xml:space="preserve">MR-B01. The deliverable must include </w:t>
       </w:r>
@@ -1085,6 +1440,9 @@
         <w:pStyle w:val="Requirement-HeaderS4"/>
       </w:pPr>
       <w:r>
+        <w:t xml:space="preserve"> </w:t>
+      </w:r>
+      <w:r>
         <w:t xml:space="preserve">MR-B02. The </w:t>
       </w:r>
       <w:r>
@@ -1112,6 +1470,10 @@
         <w:pStyle w:val="Requirement-HeaderS4"/>
       </w:pPr>
       <w:r>
+        <w:lastRenderedPageBreak/>
+        <w:t xml:space="preserve"> </w:t>
+      </w:r>
+      <w:r>
         <w:t>MR-B03. The workgroup must keep charter and risk analysis updated during the lifecycle of Level B.</w:t>
       </w:r>
     </w:p>
@@ -1127,6 +1489,9 @@
       <w:pPr>
         <w:pStyle w:val="Requirement-HeaderS4"/>
       </w:pPr>
+      <w:r>
+        <w:t xml:space="preserve"> </w:t>
+      </w:r>
       <w:r>
         <w:t>AR-B01. All analysis decisions that resolve ambiguities must be validated by a lecturer and documented.</w:t>
       </w:r>
@@ -1857,6 +2222,118 @@
     </w:lvl>
   </w:abstractNum>
   <w:abstractNum w:abstractNumId="8" w15:restartNumberingAfterBreak="0">
+    <w:nsid w:val="29765AE0"/>
+    <w:multiLevelType w:val="hybridMultilevel"/>
+    <w:tmpl w:val="F618BEA2"/>
+    <w:lvl w:ilvl="0" w:tplc="9D4C14CA">
+      <w:numFmt w:val="bullet"/>
+      <w:lvlText w:val="-"/>
+      <w:lvlJc w:val="left"/>
+      <w:pPr>
+        <w:ind w:left="927" w:hanging="360"/>
+      </w:pPr>
+      <w:rPr>
+        <w:rFonts w:ascii="Calibri" w:eastAsiaTheme="minorHAnsi" w:hAnsi="Calibri" w:cs="Calibri" w:hint="default"/>
+      </w:rPr>
+    </w:lvl>
+    <w:lvl w:ilvl="1" w:tplc="0C0A0003" w:tentative="1">
+      <w:start w:val="1"/>
+      <w:numFmt w:val="bullet"/>
+      <w:lvlText w:val="o"/>
+      <w:lvlJc w:val="left"/>
+      <w:pPr>
+        <w:ind w:left="1647" w:hanging="360"/>
+      </w:pPr>
+      <w:rPr>
+        <w:rFonts w:ascii="Courier New" w:hAnsi="Courier New" w:cs="Courier New" w:hint="default"/>
+      </w:rPr>
+    </w:lvl>
+    <w:lvl w:ilvl="2" w:tplc="0C0A0005" w:tentative="1">
+      <w:start w:val="1"/>
+      <w:numFmt w:val="bullet"/>
+      <w:lvlText w:val=""/>
+      <w:lvlJc w:val="left"/>
+      <w:pPr>
+        <w:ind w:left="2367" w:hanging="360"/>
+      </w:pPr>
+      <w:rPr>
+        <w:rFonts w:ascii="Wingdings" w:hAnsi="Wingdings" w:hint="default"/>
+      </w:rPr>
+    </w:lvl>
+    <w:lvl w:ilvl="3" w:tplc="0C0A0001" w:tentative="1">
+      <w:start w:val="1"/>
+      <w:numFmt w:val="bullet"/>
+      <w:lvlText w:val=""/>
+      <w:lvlJc w:val="left"/>
+      <w:pPr>
+        <w:ind w:left="3087" w:hanging="360"/>
+      </w:pPr>
+      <w:rPr>
+        <w:rFonts w:ascii="Symbol" w:hAnsi="Symbol" w:hint="default"/>
+      </w:rPr>
+    </w:lvl>
+    <w:lvl w:ilvl="4" w:tplc="0C0A0003" w:tentative="1">
+      <w:start w:val="1"/>
+      <w:numFmt w:val="bullet"/>
+      <w:lvlText w:val="o"/>
+      <w:lvlJc w:val="left"/>
+      <w:pPr>
+        <w:ind w:left="3807" w:hanging="360"/>
+      </w:pPr>
+      <w:rPr>
+        <w:rFonts w:ascii="Courier New" w:hAnsi="Courier New" w:cs="Courier New" w:hint="default"/>
+      </w:rPr>
+    </w:lvl>
+    <w:lvl w:ilvl="5" w:tplc="0C0A0005" w:tentative="1">
+      <w:start w:val="1"/>
+      <w:numFmt w:val="bullet"/>
+      <w:lvlText w:val=""/>
+      <w:lvlJc w:val="left"/>
+      <w:pPr>
+        <w:ind w:left="4527" w:hanging="360"/>
+      </w:pPr>
+      <w:rPr>
+        <w:rFonts w:ascii="Wingdings" w:hAnsi="Wingdings" w:hint="default"/>
+      </w:rPr>
+    </w:lvl>
+    <w:lvl w:ilvl="6" w:tplc="0C0A0001" w:tentative="1">
+      <w:start w:val="1"/>
+      <w:numFmt w:val="bullet"/>
+      <w:lvlText w:val=""/>
+      <w:lvlJc w:val="left"/>
+      <w:pPr>
+        <w:ind w:left="5247" w:hanging="360"/>
+      </w:pPr>
+      <w:rPr>
+        <w:rFonts w:ascii="Symbol" w:hAnsi="Symbol" w:hint="default"/>
+      </w:rPr>
+    </w:lvl>
+    <w:lvl w:ilvl="7" w:tplc="0C0A0003" w:tentative="1">
+      <w:start w:val="1"/>
+      <w:numFmt w:val="bullet"/>
+      <w:lvlText w:val="o"/>
+      <w:lvlJc w:val="left"/>
+      <w:pPr>
+        <w:ind w:left="5967" w:hanging="360"/>
+      </w:pPr>
+      <w:rPr>
+        <w:rFonts w:ascii="Courier New" w:hAnsi="Courier New" w:cs="Courier New" w:hint="default"/>
+      </w:rPr>
+    </w:lvl>
+    <w:lvl w:ilvl="8" w:tplc="0C0A0005" w:tentative="1">
+      <w:start w:val="1"/>
+      <w:numFmt w:val="bullet"/>
+      <w:lvlText w:val=""/>
+      <w:lvlJc w:val="left"/>
+      <w:pPr>
+        <w:ind w:left="6687" w:hanging="360"/>
+      </w:pPr>
+      <w:rPr>
+        <w:rFonts w:ascii="Wingdings" w:hAnsi="Wingdings" w:hint="default"/>
+      </w:rPr>
+    </w:lvl>
+  </w:abstractNum>
+  <w:abstractNum w:abstractNumId="9" w15:restartNumberingAfterBreak="0">
     <w:nsid w:val="29B247E1"/>
     <w:multiLevelType w:val="hybridMultilevel"/>
     <w:tmpl w:val="26DE8622"/>
@@ -1942,7 +2419,7 @@
       </w:pPr>
     </w:lvl>
   </w:abstractNum>
-  <w:abstractNum w:abstractNumId="9" w15:restartNumberingAfterBreak="0">
+  <w:abstractNum w:abstractNumId="10" w15:restartNumberingAfterBreak="0">
     <w:nsid w:val="3FB710D9"/>
     <w:multiLevelType w:val="multilevel"/>
     <w:tmpl w:val="32D43E88"/>
@@ -2055,7 +2532,7 @@
       </w:pPr>
     </w:lvl>
   </w:abstractNum>
-  <w:abstractNum w:abstractNumId="10" w15:restartNumberingAfterBreak="0">
+  <w:abstractNum w:abstractNumId="11" w15:restartNumberingAfterBreak="0">
     <w:nsid w:val="45C31073"/>
     <w:multiLevelType w:val="multilevel"/>
     <w:tmpl w:val="696480DE"/>
@@ -2204,7 +2681,119 @@
       </w:rPr>
     </w:lvl>
   </w:abstractNum>
-  <w:abstractNum w:abstractNumId="11" w15:restartNumberingAfterBreak="0">
+  <w:abstractNum w:abstractNumId="12" w15:restartNumberingAfterBreak="0">
+    <w:nsid w:val="4A8A53FD"/>
+    <w:multiLevelType w:val="hybridMultilevel"/>
+    <w:tmpl w:val="8C72592A"/>
+    <w:lvl w:ilvl="0" w:tplc="DB9A1B96">
+      <w:numFmt w:val="bullet"/>
+      <w:lvlText w:val="-"/>
+      <w:lvlJc w:val="left"/>
+      <w:pPr>
+        <w:ind w:left="720" w:hanging="360"/>
+      </w:pPr>
+      <w:rPr>
+        <w:rFonts w:ascii="Calibri" w:eastAsiaTheme="minorHAnsi" w:hAnsi="Calibri" w:cs="Calibri" w:hint="default"/>
+      </w:rPr>
+    </w:lvl>
+    <w:lvl w:ilvl="1" w:tplc="0C0A0003" w:tentative="1">
+      <w:start w:val="1"/>
+      <w:numFmt w:val="bullet"/>
+      <w:lvlText w:val="o"/>
+      <w:lvlJc w:val="left"/>
+      <w:pPr>
+        <w:ind w:left="1440" w:hanging="360"/>
+      </w:pPr>
+      <w:rPr>
+        <w:rFonts w:ascii="Courier New" w:hAnsi="Courier New" w:cs="Courier New" w:hint="default"/>
+      </w:rPr>
+    </w:lvl>
+    <w:lvl w:ilvl="2" w:tplc="0C0A0005" w:tentative="1">
+      <w:start w:val="1"/>
+      <w:numFmt w:val="bullet"/>
+      <w:lvlText w:val=""/>
+      <w:lvlJc w:val="left"/>
+      <w:pPr>
+        <w:ind w:left="2160" w:hanging="360"/>
+      </w:pPr>
+      <w:rPr>
+        <w:rFonts w:ascii="Wingdings" w:hAnsi="Wingdings" w:hint="default"/>
+      </w:rPr>
+    </w:lvl>
+    <w:lvl w:ilvl="3" w:tplc="0C0A0001" w:tentative="1">
+      <w:start w:val="1"/>
+      <w:numFmt w:val="bullet"/>
+      <w:lvlText w:val=""/>
+      <w:lvlJc w:val="left"/>
+      <w:pPr>
+        <w:ind w:left="2880" w:hanging="360"/>
+      </w:pPr>
+      <w:rPr>
+        <w:rFonts w:ascii="Symbol" w:hAnsi="Symbol" w:hint="default"/>
+      </w:rPr>
+    </w:lvl>
+    <w:lvl w:ilvl="4" w:tplc="0C0A0003" w:tentative="1">
+      <w:start w:val="1"/>
+      <w:numFmt w:val="bullet"/>
+      <w:lvlText w:val="o"/>
+      <w:lvlJc w:val="left"/>
+      <w:pPr>
+        <w:ind w:left="3600" w:hanging="360"/>
+      </w:pPr>
+      <w:rPr>
+        <w:rFonts w:ascii="Courier New" w:hAnsi="Courier New" w:cs="Courier New" w:hint="default"/>
+      </w:rPr>
+    </w:lvl>
+    <w:lvl w:ilvl="5" w:tplc="0C0A0005" w:tentative="1">
+      <w:start w:val="1"/>
+      <w:numFmt w:val="bullet"/>
+      <w:lvlText w:val=""/>
+      <w:lvlJc w:val="left"/>
+      <w:pPr>
+        <w:ind w:left="4320" w:hanging="360"/>
+      </w:pPr>
+      <w:rPr>
+        <w:rFonts w:ascii="Wingdings" w:hAnsi="Wingdings" w:hint="default"/>
+      </w:rPr>
+    </w:lvl>
+    <w:lvl w:ilvl="6" w:tplc="0C0A0001" w:tentative="1">
+      <w:start w:val="1"/>
+      <w:numFmt w:val="bullet"/>
+      <w:lvlText w:val=""/>
+      <w:lvlJc w:val="left"/>
+      <w:pPr>
+        <w:ind w:left="5040" w:hanging="360"/>
+      </w:pPr>
+      <w:rPr>
+        <w:rFonts w:ascii="Symbol" w:hAnsi="Symbol" w:hint="default"/>
+      </w:rPr>
+    </w:lvl>
+    <w:lvl w:ilvl="7" w:tplc="0C0A0003" w:tentative="1">
+      <w:start w:val="1"/>
+      <w:numFmt w:val="bullet"/>
+      <w:lvlText w:val="o"/>
+      <w:lvlJc w:val="left"/>
+      <w:pPr>
+        <w:ind w:left="5760" w:hanging="360"/>
+      </w:pPr>
+      <w:rPr>
+        <w:rFonts w:ascii="Courier New" w:hAnsi="Courier New" w:cs="Courier New" w:hint="default"/>
+      </w:rPr>
+    </w:lvl>
+    <w:lvl w:ilvl="8" w:tplc="0C0A0005" w:tentative="1">
+      <w:start w:val="1"/>
+      <w:numFmt w:val="bullet"/>
+      <w:lvlText w:val=""/>
+      <w:lvlJc w:val="left"/>
+      <w:pPr>
+        <w:ind w:left="6480" w:hanging="360"/>
+      </w:pPr>
+      <w:rPr>
+        <w:rFonts w:ascii="Wingdings" w:hAnsi="Wingdings" w:hint="default"/>
+      </w:rPr>
+    </w:lvl>
+  </w:abstractNum>
+  <w:abstractNum w:abstractNumId="13" w15:restartNumberingAfterBreak="0">
     <w:nsid w:val="4CF80724"/>
     <w:multiLevelType w:val="hybridMultilevel"/>
     <w:tmpl w:val="4A8C3E9E"/>
@@ -2294,7 +2883,7 @@
       </w:pPr>
     </w:lvl>
   </w:abstractNum>
-  <w:abstractNum w:abstractNumId="12" w15:restartNumberingAfterBreak="0">
+  <w:abstractNum w:abstractNumId="14" w15:restartNumberingAfterBreak="0">
     <w:nsid w:val="5EA362DD"/>
     <w:multiLevelType w:val="hybridMultilevel"/>
     <w:tmpl w:val="1C1827B8"/>
@@ -2417,7 +3006,7 @@
       </w:rPr>
     </w:lvl>
   </w:abstractNum>
-  <w:abstractNum w:abstractNumId="13" w15:restartNumberingAfterBreak="0">
+  <w:abstractNum w:abstractNumId="15" w15:restartNumberingAfterBreak="0">
     <w:nsid w:val="65B93E5D"/>
     <w:multiLevelType w:val="hybridMultilevel"/>
     <w:tmpl w:val="904AEBCA"/>
@@ -2532,7 +3121,7 @@
       </w:rPr>
     </w:lvl>
   </w:abstractNum>
-  <w:abstractNum w:abstractNumId="14" w15:restartNumberingAfterBreak="0">
+  <w:abstractNum w:abstractNumId="16" w15:restartNumberingAfterBreak="0">
     <w:nsid w:val="6AA80ACD"/>
     <w:multiLevelType w:val="hybridMultilevel"/>
     <w:tmpl w:val="0B6A45A6"/>
@@ -2622,7 +3211,7 @@
       </w:pPr>
     </w:lvl>
   </w:abstractNum>
-  <w:abstractNum w:abstractNumId="15" w15:restartNumberingAfterBreak="0">
+  <w:abstractNum w:abstractNumId="17" w15:restartNumberingAfterBreak="0">
     <w:nsid w:val="70A83F65"/>
     <w:multiLevelType w:val="hybridMultilevel"/>
     <w:tmpl w:val="75EC4E66"/>
@@ -2736,13 +3325,13 @@
     </w:lvl>
   </w:abstractNum>
   <w:num w:numId="1" w16cid:durableId="130024923">
-    <w:abstractNumId w:val="12"/>
+    <w:abstractNumId w:val="14"/>
   </w:num>
   <w:num w:numId="2" w16cid:durableId="1545869788">
     <w:abstractNumId w:val="7"/>
   </w:num>
   <w:num w:numId="3" w16cid:durableId="1564486959">
-    <w:abstractNumId w:val="13"/>
+    <w:abstractNumId w:val="15"/>
   </w:num>
   <w:num w:numId="4" w16cid:durableId="1926187081">
     <w:abstractNumId w:val="4"/>
@@ -2751,22 +3340,22 @@
     <w:abstractNumId w:val="0"/>
   </w:num>
   <w:num w:numId="6" w16cid:durableId="372539000">
+    <w:abstractNumId w:val="11"/>
+  </w:num>
+  <w:num w:numId="7" w16cid:durableId="414136295">
     <w:abstractNumId w:val="10"/>
   </w:num>
-  <w:num w:numId="7" w16cid:durableId="414136295">
-    <w:abstractNumId w:val="9"/>
-  </w:num>
   <w:num w:numId="8" w16cid:durableId="584798701">
-    <w:abstractNumId w:val="14"/>
+    <w:abstractNumId w:val="16"/>
   </w:num>
   <w:num w:numId="9" w16cid:durableId="932054179">
     <w:abstractNumId w:val="0"/>
   </w:num>
   <w:num w:numId="10" w16cid:durableId="398940351">
-    <w:abstractNumId w:val="15"/>
+    <w:abstractNumId w:val="17"/>
   </w:num>
   <w:num w:numId="11" w16cid:durableId="139075569">
-    <w:abstractNumId w:val="8"/>
+    <w:abstractNumId w:val="9"/>
   </w:num>
   <w:num w:numId="12" w16cid:durableId="775640643">
     <w:abstractNumId w:val="5"/>
@@ -2781,10 +3370,16 @@
     <w:abstractNumId w:val="6"/>
   </w:num>
   <w:num w:numId="16" w16cid:durableId="832725286">
-    <w:abstractNumId w:val="11"/>
+    <w:abstractNumId w:val="13"/>
   </w:num>
   <w:num w:numId="17" w16cid:durableId="476338752">
     <w:abstractNumId w:val="1"/>
+  </w:num>
+  <w:num w:numId="18" w16cid:durableId="1722708120">
+    <w:abstractNumId w:val="8"/>
+  </w:num>
+  <w:num w:numId="19" w16cid:durableId="217404987">
+    <w:abstractNumId w:val="12"/>
   </w:num>
 </w:numbering>
 </file>
@@ -3285,7 +3880,6 @@
   <w:style w:type="character" w:default="1" w:styleId="Fuentedeprrafopredeter">
     <w:name w:val="Default Paragraph Font"/>
     <w:uiPriority w:val="1"/>
-    <w:semiHidden/>
     <w:unhideWhenUsed/>
   </w:style>
   <w:style w:type="table" w:default="1" w:styleId="Tablanormal">

</xml_diff>

<commit_message>
docs: Add planning, risk and model documentation
</commit_message>
<xml_diff>
--- a/reports/Group/02 - Requirements - Level B (Structured).docx
+++ b/reports/Group/02 - Requirements - Level B (Structured).docx
@@ -424,48 +424,36 @@
         <w:pStyle w:val="Requirement-HeaderS4"/>
       </w:pPr>
       <w:r>
-        <w:t xml:space="preserve">IR-B08. The system must store ad banners with </w:t>
+        <w:t>IR-B08. The system must store ad banners with slogan, target URL, and pictureUrl.</w:t>
       </w:r>
       <w:r>
         <w:rPr>
           <w:b/>
           <w:bCs/>
         </w:rPr>
-        <w:t>slogan</w:t>
-      </w:r>
-      <w:r>
-        <w:t xml:space="preserve">, </w:t>
-      </w:r>
+      </w:r>
+      <w:r/>
       <w:r>
         <w:rPr>
           <w:b/>
           <w:bCs/>
         </w:rPr>
-        <w:t>target</w:t>
-      </w:r>
-      <w:r>
-        <w:t xml:space="preserve"> </w:t>
-      </w:r>
+      </w:r>
+      <w:r/>
       <w:r>
         <w:rPr>
           <w:b/>
           <w:bCs/>
         </w:rPr>
-        <w:t>URL</w:t>
-      </w:r>
-      <w:r>
-        <w:t xml:space="preserve">, and </w:t>
-      </w:r>
+      </w:r>
+      <w:r/>
       <w:r>
         <w:rPr>
           <w:b/>
           <w:bCs/>
         </w:rPr>
-        <w:t>picture</w:t>
-      </w:r>
-      <w:r>
-        <w:t>.</w:t>
-      </w:r>
+      </w:r>
+      <w:r/>
     </w:p>
     <w:p>
       <w:pPr>
@@ -665,11 +653,9 @@
         <w:pStyle w:val="Requirement-HeaderS4"/>
       </w:pPr>
       <w:r>
-        <w:t xml:space="preserve"> </w:t>
-      </w:r>
-      <w:r>
-        <w:t>FR-B03. A manager must be able to select and manage project members (inventors, spokespeople, and fundraisers).</w:t>
-      </w:r>
+        <w:t xml:space="preserve"> FR-B03. A manager must be able to create , update , and display project memberships for inventors , spokespeople , and fundraisers . Deletion of a membership is not permitted once a member has been added to a project.</w:t>
+      </w:r>
+      <w:r/>
     </w:p>
     <w:p>
       <w:pPr>
@@ -868,21 +854,16 @@
         <w:pStyle w:val="Requirement-HeaderS4"/>
       </w:pPr>
       <w:r>
-        <w:t xml:space="preserve"> </w:t>
-      </w:r>
-      <w:r>
-        <w:t xml:space="preserve">FR-B08. Managers must have </w:t>
-      </w:r>
+        <w:t xml:space="preserve"> FR-B08. Managers must have dashboards with total projects managed; deviation vs. other managers measured as the difference between the manager's total projects and the mean number of projects managed by the rest of the managers (displayed as N/A when the manager is the only manager in the system); and min/max/average/standard deviation of project effort.</w:t>
+      </w:r>
+      <w:r/>
       <w:r>
         <w:rPr>
           <w:b/>
           <w:bCs/>
         </w:rPr>
-        <w:t>dashboards</w:t>
-      </w:r>
-      <w:r>
-        <w:t xml:space="preserve"> with total projects managed; deviation vs. other managers measured as the absolute difference with respect to the mean number of projects managed by all managers; and min/max/average/standard deviation of project effort.</w:t>
-      </w:r>
+      </w:r>
+      <w:r/>
     </w:p>
     <w:p>
       <w:pPr>

</xml_diff>